<commit_message>
experience/2026: program-announcement card, fix sim/title overlap, target-company lists
- New general card-00-program.png ("THE PROGRAM IS OUT") with an
  application-tag cloud (e-drivetrains, bearings, hydropower, ...)
- Fix title/sim overlap on sim cards: long titles now fit above the
  sim panel (re-rendered card-06 SKF and card-09 Univance)
- LinkedIn doc: add an announcement post + 30 industry-matched
  companies to tag/target under every post; build_posts.py is the
  source of truth, regenerates both .md and .docx

Co-Authored-By: Claude Opus 4.8 (1M context) <noreply@anthropic.com>
</commit_message>
<xml_diff>
--- a/experience/cards/linkedin-posts-2026.docx
+++ b/experience/cards/linkedin-posts-2026.docx
@@ -16,6 +16,93 @@
           <w:i/>
         </w:rPr>
         <w:t>Ready-to-publish posts, one per speaker (styled like the 2024 edition). Swap the register link for a lnkd.in short link if preferred. Suggested image to attach is noted under each post.</w:t>
+      </w:r>
+    </w:p>
+    <w:p/>
+    <w:p>
+      <w:r>
+        <w:rPr>
+          <w:b/>
+          <w:sz w:val="26"/>
+        </w:rPr>
+        <w:t>📣 THE PROGRAM IS OUT</w:t>
+      </w:r>
+    </w:p>
+    <w:p>
+      <w:r>
+        <w:t>The full programme for Particleworks Experience 2026 is online — 10 talks across two days in Modena, spanning e-drivetrains, e-motor cooling, bearings, gearboxes, gear lubrication, pumps, hydropower, aerospace and aeration.</w:t>
+      </w:r>
+    </w:p>
+    <w:p>
+      <w:r>
+        <w:t>Join the meshless-CFD community on 6–7 October:</w:t>
+      </w:r>
+    </w:p>
+    <w:p>
+      <w:pPr>
+        <w:pStyle w:val="ListBullet"/>
+      </w:pPr>
+      <w:r>
+        <w:t>10 validated industrial &amp; academic case studies</w:t>
+      </w:r>
+    </w:p>
+    <w:p>
+      <w:pPr>
+        <w:pStyle w:val="ListBullet"/>
+      </w:pPr>
+      <w:r>
+        <w:t>The release of Particleworks 9.0 and Granuleworks 4.0</w:t>
+      </w:r>
+    </w:p>
+    <w:p>
+      <w:pPr>
+        <w:pStyle w:val="ListBullet"/>
+      </w:pPr>
+      <w:r>
+        <w:t>Hands-on workshops and networking at BPER FORUM Monzani</w:t>
+      </w:r>
+    </w:p>
+    <w:p>
+      <w:r>
+        <w:t>📍 Modena, Italy 🇮🇹</w:t>
+      </w:r>
+    </w:p>
+    <w:p>
+      <w:r>
+        <w:t>📅 6-7 Oct 2026</w:t>
+      </w:r>
+    </w:p>
+    <w:p>
+      <w:r>
+        <w:t>See the full program and register for free: https://particleworks-europe.com/experience/program.php</w:t>
+      </w:r>
+    </w:p>
+    <w:p>
+      <w:r>
+        <w:rPr>
+          <w:i/>
+          <w:color w:val="6C757D"/>
+        </w:rPr>
+        <w:t>🖼️ Suggested image: card-00-program.png</w:t>
+      </w:r>
+    </w:p>
+    <w:p>
+      <w:r>
+        <w:rPr>
+          <w:b/>
+        </w:rPr>
+        <w:t xml:space="preserve">🏷️ 30 companies to tag / target: </w:t>
+      </w:r>
+      <w:r>
+        <w:t>ZF, Bosch, Schaeffler, Continental, Vitesco Technologies, BorgWarner, Magna, Dana, GKN Automotive, Valeo, Mahle, Marelli, Stellantis, Volkswagen Group, BMW Group, Mercedes-Benz, Renault Group, Volvo Cars, Ferrari, Toyota, Hyundai Motor Group, Nidec, AVL, FEV, Ricardo, MTU Aero Engines, Rolls-Royce, Safran, SKF, Comer Industries</w:t>
+      </w:r>
+    </w:p>
+    <w:p>
+      <w:pPr>
+        <w:jc w:val="center"/>
+      </w:pPr>
+      <w:r>
+        <w:t>— — — — — — — — — — — — — — — — — — — —</w:t>
       </w:r>
     </w:p>
     <w:p/>
@@ -84,6 +171,17 @@
           <w:color w:val="6C757D"/>
         </w:rPr>
         <w:t>🖼️ Suggested image: card-01-prometech.png</w:t>
+      </w:r>
+    </w:p>
+    <w:p>
+      <w:r>
+        <w:rPr>
+          <w:b/>
+        </w:rPr>
+        <w:t xml:space="preserve">🏷️ 30 companies to tag / target: </w:t>
+      </w:r>
+      <w:r>
+        <w:t>Robert Bosch, ZF Friedrichshafen, Schaeffler, Continental, Vitesco Technologies, BorgWarner, Magna, Valeo, Mahle, Dana, GKN Automotive, IAV, AVL, FEV, Ricardo, hofer powertrain, Bertrandt, EDAG Engineering, Porsche Engineering, Stellantis, BMW Group, Mercedes-Benz, Volkswagen Group, Toyota, Honda, Hyundai Motor Group, Nidec, Marelli, Denso, Aisin</w:t>
       </w:r>
     </w:p>
     <w:p>
@@ -163,6 +261,17 @@
       </w:r>
     </w:p>
     <w:p>
+      <w:r>
+        <w:rPr>
+          <w:b/>
+        </w:rPr>
+        <w:t xml:space="preserve">🏷️ 30 companies to tag / target: </w:t>
+      </w:r>
+      <w:r>
+        <w:t>Rolls-Royce, Safran, GE Aerospace, Pratt &amp; Whitney, Honeywell Aerospace, Avio Aero, ITP Aero, GKN Aerospace, Collins Aerospace, Liebherr-Aerospace, Leonardo, Airbus, Boeing, Williams International, ArianeGroup, Curtiss-Wright Surface Technologies, Metal Improvement Company, Wheelabrator (Norican Group), Rösler Oberflächentechnik, Sintokogio, Sturm Maschinenbau, KSA Kugelstrahltechnik, Engineered Abrasives, Oerlikon Balzers, Bodycote, Doncasters Group, Howmet Aerospace, Rheinmetall, MTU Maintenance, Praxair Surface Technologies</w:t>
+      </w:r>
+    </w:p>
+    <w:p>
       <w:pPr>
         <w:jc w:val="center"/>
       </w:pPr>
@@ -236,6 +345,17 @@
           <w:color w:val="6C757D"/>
         </w:rPr>
         <w:t>🖼️ Suggested image: card-03-unimore-stator.png</w:t>
+      </w:r>
+    </w:p>
+    <w:p>
+      <w:r>
+        <w:rPr>
+          <w:b/>
+        </w:rPr>
+        <w:t xml:space="preserve">🏷️ 30 companies to tag / target: </w:t>
+      </w:r>
+      <w:r>
+        <w:t>Vitesco Technologies, BorgWarner, ZF, Bosch, Mahle, Valeo, Nidec, Magna Powertrain, Dana TM4, Schaeffler, hofer powertrain, Equipmake, YASA, Marelli, Hyundai Mobis, Hyundai Transys, Aisin, Denso, Tesla, Rivian, Lucid Motors, BMW Group, Mercedes-Benz, Volkswagen Group, Porsche, Stellantis, BYD, Rimac Technology, Drive System Design, AVL</w:t>
       </w:r>
     </w:p>
     <w:p>
@@ -315,6 +435,17 @@
       </w:r>
     </w:p>
     <w:p>
+      <w:r>
+        <w:rPr>
+          <w:b/>
+        </w:rPr>
+        <w:t xml:space="preserve">🏷️ 30 companies to tag / target: </w:t>
+      </w:r>
+      <w:r>
+        <w:t>KSB, Grundfos, Sulzer, Wilo, Bosch Rexroth, Parker Hannifin, Danfoss Power Solutions, Eaton, HAWE Hydraulik, Moog, Xylem, Flowserve, Weir Group, ITT, Pentair, Casappa, Bucher Hydraulics, Marzocchi Pompe, Kawasaki Precision Machinery, Bondioli &amp; Pavesi, Interpump Group, HYDAC, Argo-Hytos, Graco, Pierburg, Continental, Caterpillar, Liebherr, Brevini, Duplomatic MS</w:t>
+      </w:r>
+    </w:p>
+    <w:p>
       <w:pPr>
         <w:jc w:val="center"/>
       </w:pPr>
@@ -388,6 +519,17 @@
           <w:color w:val="6C757D"/>
         </w:rPr>
         <w:t>🖼️ Suggested image: card-05-hesso-pelton.png</w:t>
+      </w:r>
+    </w:p>
+    <w:p>
+      <w:r>
+        <w:rPr>
+          <w:b/>
+        </w:rPr>
+        <w:t xml:space="preserve">🏷️ 30 companies to tag / target: </w:t>
+      </w:r>
+      <w:r>
+        <w:t>Voith Hydro, Andritz Hydro, GE Vernova Hydro, Gilkes, Litostroj Power, ZECO Hydropower, Canyon Hydro, Global Hydro Energy, Mavel, Rainpower, EDF, Statkraft, Verbund, Enel Green Power, Hydro-Québec, Axpo, Alpiq, BKW, Iberdrola, Vattenfall, Norconsult, Stucky (Gruner Group), AFRY, WWS Wasserkraft, Toshiba Energy Systems, Sulzer, Tractebel, SN Power, Troy Hydro, Mecamidi</w:t>
       </w:r>
     </w:p>
     <w:p>
@@ -467,6 +609,17 @@
       </w:r>
     </w:p>
     <w:p>
+      <w:r>
+        <w:rPr>
+          <w:b/>
+        </w:rPr>
+        <w:t xml:space="preserve">🏷️ 30 companies to tag / target: </w:t>
+      </w:r>
+      <w:r>
+        <w:t>Schaeffler, NSK, NTN, The Timken Company, JTEKT (Koyo), GMN Bearing, IKO Nippon Thompson, RBC Bearings, ZF, Bosch, Dana, GKN Automotive, BorgWarner, Comer Industries, Bonfiglioli, Carraro, Oerlikon Graziano, Allison Transmission, Eaton, Aisin, Voith, Flender, Siemens Gamesa, Vestas, Nordex, Liebherr, Caterpillar, Komatsu, Danfoss, Wittenstein</w:t>
+      </w:r>
+    </w:p>
+    <w:p>
       <w:pPr>
         <w:jc w:val="center"/>
       </w:pPr>
@@ -540,6 +693,17 @@
           <w:color w:val="6C757D"/>
         </w:rPr>
         <w:t>🖼️ Suggested image: card-07-deepfluid.png</w:t>
+      </w:r>
+    </w:p>
+    <w:p>
+      <w:r>
+        <w:rPr>
+          <w:b/>
+        </w:rPr>
+        <w:t xml:space="preserve">🏷️ 30 companies to tag / target: </w:t>
+      </w:r>
+      <w:r>
+        <w:t>FUCHS, Klüber Lubrication, Shell, TotalEnergies, Castrol (BP), ExxonMobil, Petronas Lubricants, Liqui Moly, Bosch Rexroth, Parker Hannifin, Danfoss, HAWE Hydraulik, HYDAC, Moog, ZF, Schaeffler, Flender, SEW-Eurodrive, Bonfiglioli, Wittenstein, Bosch, Eaton, Comer Industries, Voith, GKN Automotive, Dana, Argo-Hytos, Stauff, MAHLE, Mann+Hummel</w:t>
       </w:r>
     </w:p>
     <w:p>
@@ -619,6 +783,17 @@
       </w:r>
     </w:p>
     <w:p>
+      <w:r>
+        <w:rPr>
+          <w:b/>
+        </w:rPr>
+        <w:t xml:space="preserve">🏷️ 30 companies to tag / target: </w:t>
+      </w:r>
+      <w:r>
+        <w:t>Caterpillar, Komatsu, Liebherr, John Deere, Hitachi Construction Machinery, Volvo CE, JCB, Develon (Doosan), Hyundai Construction Equipment, Kubota, CNH Industrial, Bobcat, Sany, XCMG, Zoomlion, Berco (thyssenkrupp), Italtractor ITM, Titan International, Camso (Michelin), USCO, Topy Industries, Prinoth, Kässbohrer (PistenBully), Claas, AGCO, Manitou, Terex, Wacker Neuson, Takeuchi, Yanmar</w:t>
+      </w:r>
+    </w:p>
+    <w:p>
       <w:pPr>
         <w:jc w:val="center"/>
       </w:pPr>
@@ -695,6 +870,17 @@
       </w:r>
     </w:p>
     <w:p>
+      <w:r>
+        <w:rPr>
+          <w:b/>
+        </w:rPr>
+        <w:t xml:space="preserve">🏷️ 30 companies to tag / target: </w:t>
+      </w:r>
+      <w:r>
+        <w:t>Aisin, JTEKT, Hyundai Transys, ZF, GKN Automotive, Dana, BorgWarner, Schaeffler, Eaton, Allison Transmission, Oerlikon Graziano, Comer Industries, Bonfiglioli, Carraro, Brevini, Flender, SEW-Eurodrive, Wittenstein, Magna Powertrain, Marelli, Punch Powertrain, Vitesco Technologies, Drive System Design, Ricardo, AVL, FEV, Voith, Bharat Forge, Getrag, Bosch</w:t>
+      </w:r>
+    </w:p>
+    <w:p>
       <w:pPr>
         <w:jc w:val="center"/>
       </w:pPr>
@@ -768,6 +954,17 @@
           <w:color w:val="6C757D"/>
         </w:rPr>
         <w:t>🖼️ Suggested image: card-10-iav.png</w:t>
+      </w:r>
+    </w:p>
+    <w:p>
+      <w:r>
+        <w:rPr>
+          <w:b/>
+        </w:rPr>
+        <w:t xml:space="preserve">🏷️ 30 companies to tag / target: </w:t>
+      </w:r>
+      <w:r>
+        <w:t>Daimler Truck, Volvo Trucks, Scania, MAN Truck &amp; Bus, Traton Group, Iveco Group, PACCAR (DAF), CNH Industrial, ZF, Bosch, Vitesco Technologies, BorgWarner, Dana, Allison Transmission, Eaton, Voith, Schaeffler, Magna, AVL, FEV, Ricardo, Cummins, Deutz, Bharat Forge, Meritor, Hyundai Motor, BYD, Punch Powertrain, hofer powertrain, Drive System Design</w:t>
       </w:r>
     </w:p>
     <w:sectPr>

</xml_diff>

<commit_message>
experience/2026: re-render cards after generator update; fix card-00 tag overflow
- Run cards_build.py: regenerate all cards incl. card-01 two-title
  keynote (Issei Masaie + Iori Saigo) and refreshed card-00 tag set
- card-00: new longer tag labels wrapped to 4 rows and pushed the CTA
  onto the logo — tighten tag font/spacing so 9 tags fit 3 rows, CTA
  capped above the logo
- Regenerate linkedin-posts .md/.docx from updated build_posts.py
  (keynote split into two presenters) + refresh PPTX

Co-Authored-By: Claude Opus 4.8 (1M context) <noreply@anthropic.com>
</commit_message>
<xml_diff>
--- a/experience/cards/linkedin-posts-2026.docx
+++ b/experience/cards/linkedin-posts-2026.docx
@@ -117,7 +117,7 @@
     </w:p>
     <w:p>
       <w:r>
-        <w:t>Iori Saigo from Prometech Software will unveil the latest Particleworks 9.0 and Granuleworks 4.0 releases.</w:t>
+        <w:t>Issei Masaie and Iori Saigo from Prometech Software will unveil the latest Particleworks 9.0 and Granuleworks 4.0 releases — in two parts: what's new, then application examples and case studies.</w:t>
       </w:r>
     </w:p>
     <w:p>
@@ -130,7 +130,7 @@
         <w:pStyle w:val="ListBullet"/>
       </w:pPr>
       <w:r>
-        <w:t>Major gains in simulation performance and GPU efficiency</w:t>
+        <w:t>Issei Masaie — What's New: major gains in simulation performance and GPU efficiency</w:t>
       </w:r>
     </w:p>
     <w:p>
@@ -146,7 +146,7 @@
         <w:pStyle w:val="ListBullet"/>
       </w:pPr>
       <w:r>
-        <w:t>Application examples and case studies from the latest developments</w:t>
+        <w:t>Iori Saigo — Application Examples &amp; Case Studies from the latest developments</w:t>
       </w:r>
     </w:p>
     <w:p>

</xml_diff>

<commit_message>
experience/2026: add Börger FlowSep talk (Valtwies + Sala)
New 11th talk — "Simulation of Sand Separation and Wear in the Börger
FlowSep" by Bernd Valtwies (Börger GmbH) with co-presenter Riccardo Sala
(EnginSoft).

- cards: new dual-speaker card-11-boerger.png (two avatars + FlowSep panel);
  cards_build.py gains a two-speaker footer layout; speaker grid → 12 faces
  (Bernd + Riccardo adjacent); program/speaker counts 10 → 11 talks; PPTX
  re-rendered
- program.html/php: TALK 10 article #talk-flowsep with custom centrifugal
  SVG, both speakers, abstract, authors; hero 11 talks
- index.html/php: Börger topic card (Börger GmbH · EnginSoft)
- linkedin-posts-2026 (md + docx): new Börger post + updated program-out
  counts, via build_posts.py
- teaser: rewritten as a frame-accurate cardboard stop-motion concept
- assets: bernd-valtwies + riccardo-sala headshots, boerger-flowsep image

Co-Authored-By: Claude Opus 4.8 (1M context) <noreply@anthropic.com>
</commit_message>
<xml_diff>
--- a/experience/cards/linkedin-posts-2026.docx
+++ b/experience/cards/linkedin-posts-2026.docx
@@ -30,7 +30,7 @@
     </w:p>
     <w:p>
       <w:r>
-        <w:t>The full programme for Particleworks Experience 2026 is online — 10 talks across two days in Modena, spanning e-drivetrains, e-motor cooling, bearings, gearboxes, gear lubrication, pumps, hydropower, aerospace and aeration.</w:t>
+        <w:t>The full programme for Particleworks Experience 2026 is online — 11 talks across two days in Modena, spanning e-drivetrains, e-motor cooling, bearings, gearboxes, gear lubrication, pumps, hydropower, aerospace, aeration and solid–liquid separation.</w:t>
       </w:r>
     </w:p>
     <w:p>
@@ -43,7 +43,7 @@
         <w:pStyle w:val="ListBullet"/>
       </w:pPr>
       <w:r>
-        <w:t>10 validated industrial &amp; academic case studies</w:t>
+        <w:t>11 validated industrial &amp; academic case studies</w:t>
       </w:r>
     </w:p>
     <w:p>
@@ -967,6 +967,93 @@
         <w:t>Daimler Truck, Volvo Trucks, Scania, MAN Truck &amp; Bus, Traton Group, Iveco Group, PACCAR (DAF), CNH Industrial, ZF, Bosch, Vitesco Technologies, BorgWarner, Dana, Allison Transmission, Eaton, Voith, Schaeffler, Magna, AVL, FEV, Ricardo, Cummins, Deutz, Bharat Forge, Meritor, Hyundai Motor, BYD, Punch Powertrain, hofer powertrain, Drive System Design</w:t>
       </w:r>
     </w:p>
+    <w:p>
+      <w:pPr>
+        <w:jc w:val="center"/>
+      </w:pPr>
+      <w:r>
+        <w:t>— — — — — — — — — — — — — — — — — — — —</w:t>
+      </w:r>
+    </w:p>
+    <w:p/>
+    <w:p>
+      <w:r>
+        <w:rPr>
+          <w:b/>
+          <w:sz w:val="26"/>
+        </w:rPr>
+        <w:t>⚙️ SAND SEPARATION &amp; WEAR IN THE BÖRGER FLOWSEP</w:t>
+      </w:r>
+    </w:p>
+    <w:p>
+      <w:r>
+        <w:t>Bernd Valtwies from Börger GmbH — together with Riccardo Sala from EnginSoft — will show how Particleworks simulates centrifugal sand separation and the wear it drives inside the Börger FlowSep.</w:t>
+      </w:r>
+    </w:p>
+    <w:p>
+      <w:r>
+        <w:t>Leveraging particle simulation, the team was able to:</w:t>
+      </w:r>
+    </w:p>
+    <w:p>
+      <w:pPr>
+        <w:pStyle w:val="ListBullet"/>
+      </w:pPr>
+      <w:r>
+        <w:t>Resolve how abrasive sand particles are spun out of the fluid using centrifugal force</w:t>
+      </w:r>
+    </w:p>
+    <w:p>
+      <w:pPr>
+        <w:pStyle w:val="ListBullet"/>
+      </w:pPr>
+      <w:r>
+        <w:t>Predict where wear concentrates on the wetted surfaces, ahead of physical prototyping</w:t>
+      </w:r>
+    </w:p>
+    <w:p>
+      <w:pPr>
+        <w:pStyle w:val="ListBullet"/>
+      </w:pPr>
+      <w:r>
+        <w:t>Guide geometry and material choices to protect downstream pumps and extend service life</w:t>
+      </w:r>
+    </w:p>
+    <w:p>
+      <w:r>
+        <w:t>📍 Modena, Italy 🇮🇹</w:t>
+      </w:r>
+    </w:p>
+    <w:p>
+      <w:r>
+        <w:t>📅 6-7 Oct 2026</w:t>
+      </w:r>
+    </w:p>
+    <w:p>
+      <w:r>
+        <w:t>To attend Particleworks Experience 2026, register for free: https://particleworks-europe.com/experience/registration.php</w:t>
+      </w:r>
+    </w:p>
+    <w:p>
+      <w:r>
+        <w:rPr>
+          <w:i/>
+          <w:color w:val="6C757D"/>
+        </w:rPr>
+        <w:t>🖼️ Suggested image: card-11-boerger.png</w:t>
+      </w:r>
+    </w:p>
+    <w:p>
+      <w:r>
+        <w:rPr>
+          <w:b/>
+        </w:rPr>
+        <w:t xml:space="preserve">🏷️ 30 companies to tag / target: </w:t>
+      </w:r>
+      <w:r>
+        <w:t>Xylem, Sulzer, KSB, Grundfos, Wilo, Flowserve, Weir Group (Warman), GEA, Alfa Laval, Andritz Separation, Flottweg, Hiller Separation &amp; Process, Vogelsang, NETZSCH Pumps &amp; Systems, SEEPEX, WANGEN PUMPEN, Veolia Water Technologies, SUEZ, Huber SE, Nijhuis Saur Industries, Metso, FLSmidth, Weir Minerals, Royal IHC, Van Oord, Boskalis, DEME Group, Ebara, ProMinent, Börger</w:t>
+      </w:r>
+    </w:p>
     <w:sectPr>
       <w:pgSz w:w="12240" w:h="15840"/>
       <w:pgMar w:top="1440" w:right="1800" w:bottom="1440" w:left="1800" w:header="720" w:footer="720" w:gutter="0"/>

</xml_diff>